<commit_message>
Fixed font fomatting in FOC 50 and 12 templates; added .upper() to county pdf tags; fixed formatting for FOC 10d addendum
</commit_message>
<xml_diff>
--- a/docassemble/MLHMotionRegardingChildSupport/data/templates/FOC_10d_Addendum.docx
+++ b/docassemble/MLHMotionRegardingChildSupport/data/templates/FOC_10d_Addendum.docx
@@ -8,20 +8,16 @@
           <w:tab w:val="left" w:leader="dot" w:pos="7200"/>
         </w:tabs>
         <w:rPr>
-          <w:rFonts w:ascii="Times New Roman" w:hAnsi="Times New Roman" w:cs="Times New Roman"/>
+          <w:rFonts w:ascii="Arial" w:hAnsi="Arial" w:cs="Arial"/>
           <w:b/>
           <w:bCs/>
-          <w:sz w:val="24"/>
-          <w:szCs w:val="24"/>
         </w:rPr>
       </w:pPr>
       <w:r>
         <w:rPr>
-          <w:rFonts w:ascii="Times New Roman" w:hAnsi="Times New Roman" w:cs="Times New Roman"/>
+          <w:rFonts w:ascii="Arial" w:hAnsi="Arial" w:cs="Arial"/>
           <w:b/>
           <w:bCs/>
-          <w:sz w:val="24"/>
-          <w:szCs w:val="24"/>
         </w:rPr>
         <w:t>Children’s Names, continued</w:t>
       </w:r>
@@ -32,94 +28,42 @@
           <w:tab w:val="left" w:leader="dot" w:pos="7200"/>
         </w:tabs>
         <w:rPr>
-          <w:rFonts w:ascii="Times New Roman" w:hAnsi="Times New Roman" w:cs="Times New Roman"/>
-          <w:sz w:val="24"/>
-          <w:szCs w:val="24"/>
+          <w:rFonts w:ascii="Arial" w:hAnsi="Arial" w:cs="Arial"/>
         </w:rPr>
       </w:pPr>
       <w:r>
         <w:rPr>
-          <w:rFonts w:ascii="Times New Roman" w:hAnsi="Times New Roman" w:cs="Times New Roman"/>
-          <w:sz w:val="24"/>
-          <w:szCs w:val="24"/>
+          <w:rFonts w:ascii="Arial" w:hAnsi="Arial" w:cs="Arial"/>
         </w:rPr>
         <w:t>{%</w:t>
       </w:r>
       <w:r>
         <w:rPr>
-          <w:rFonts w:ascii="Times New Roman" w:hAnsi="Times New Roman" w:cs="Times New Roman"/>
-          <w:sz w:val="24"/>
-          <w:szCs w:val="24"/>
+          <w:rFonts w:ascii="Arial" w:hAnsi="Arial" w:cs="Arial"/>
           <w:highlight w:val="cyan"/>
         </w:rPr>
-        <w:t xml:space="preserve">p for </w:t>
-      </w:r>
-      <w:r>
-        <w:rPr>
-          <w:rFonts w:ascii="Times New Roman" w:hAnsi="Times New Roman" w:cs="Times New Roman"/>
-          <w:sz w:val="24"/>
-          <w:szCs w:val="24"/>
+        <w:t>p for child in children</w:t>
+      </w:r>
+      <w:r>
+        <w:rPr>
+          <w:rFonts w:ascii="Arial" w:hAnsi="Arial" w:cs="Arial"/>
           <w:highlight w:val="cyan"/>
         </w:rPr>
-        <w:t xml:space="preserve">child in </w:t>
-      </w:r>
-      <w:proofErr w:type="gramStart"/>
-      <w:r>
-        <w:rPr>
-          <w:rFonts w:ascii="Times New Roman" w:hAnsi="Times New Roman" w:cs="Times New Roman"/>
-          <w:sz w:val="24"/>
-          <w:szCs w:val="24"/>
+        <w:t>[7:]</w:t>
+      </w:r>
+      <w:r>
+        <w:rPr>
+          <w:rFonts w:ascii="Arial" w:hAnsi="Arial" w:cs="Arial"/>
           <w:highlight w:val="cyan"/>
         </w:rPr>
-        <w:t>children</w:t>
-      </w:r>
-      <w:r>
-        <w:rPr>
-          <w:rFonts w:ascii="Times New Roman" w:hAnsi="Times New Roman" w:cs="Times New Roman"/>
-          <w:sz w:val="24"/>
-          <w:szCs w:val="24"/>
-          <w:highlight w:val="cyan"/>
-        </w:rPr>
-        <w:t>[</w:t>
-      </w:r>
-      <w:proofErr w:type="gramEnd"/>
-      <w:r>
-        <w:rPr>
-          <w:rFonts w:ascii="Times New Roman" w:hAnsi="Times New Roman" w:cs="Times New Roman"/>
-          <w:sz w:val="24"/>
-          <w:szCs w:val="24"/>
-          <w:highlight w:val="cyan"/>
-        </w:rPr>
-        <w:t>7:</w:t>
-      </w:r>
-      <w:proofErr w:type="gramStart"/>
-      <w:r>
-        <w:rPr>
-          <w:rFonts w:ascii="Times New Roman" w:hAnsi="Times New Roman" w:cs="Times New Roman"/>
-          <w:sz w:val="24"/>
-          <w:szCs w:val="24"/>
-          <w:highlight w:val="cyan"/>
-        </w:rPr>
-        <w:t>]</w:t>
-      </w:r>
-      <w:r>
-        <w:rPr>
-          <w:rFonts w:ascii="Times New Roman" w:hAnsi="Times New Roman" w:cs="Times New Roman"/>
-          <w:sz w:val="24"/>
-          <w:szCs w:val="24"/>
-          <w:highlight w:val="cyan"/>
-        </w:rPr>
         <w:t xml:space="preserve"> </w:t>
       </w:r>
       <w:r>
         <w:rPr>
-          <w:rFonts w:ascii="Times New Roman" w:hAnsi="Times New Roman" w:cs="Times New Roman"/>
-          <w:sz w:val="24"/>
-          <w:szCs w:val="24"/>
+          <w:rFonts w:ascii="Arial" w:hAnsi="Arial" w:cs="Arial"/>
         </w:rPr>
         <w:t>%}</w:t>
       </w:r>
-      <w:proofErr w:type="gramEnd"/>
     </w:p>
     <w:p>
       <w:pPr>
@@ -127,91 +71,69 @@
           <w:tab w:val="left" w:leader="dot" w:pos="7920"/>
         </w:tabs>
         <w:rPr>
-          <w:rFonts w:ascii="Times New Roman" w:hAnsi="Times New Roman" w:cs="Times New Roman"/>
-          <w:sz w:val="24"/>
-          <w:szCs w:val="24"/>
+          <w:rFonts w:ascii="Arial" w:hAnsi="Arial" w:cs="Arial"/>
         </w:rPr>
       </w:pPr>
       <w:r>
         <w:rPr>
-          <w:rFonts w:ascii="Times New Roman" w:hAnsi="Times New Roman" w:cs="Times New Roman"/>
-          <w:sz w:val="24"/>
-          <w:szCs w:val="24"/>
+          <w:rFonts w:ascii="Arial" w:hAnsi="Arial" w:cs="Arial"/>
         </w:rPr>
         <w:t>{{</w:t>
       </w:r>
       <w:r>
         <w:rPr>
-          <w:rFonts w:ascii="Times New Roman" w:hAnsi="Times New Roman" w:cs="Times New Roman"/>
-          <w:sz w:val="24"/>
-          <w:szCs w:val="24"/>
+          <w:rFonts w:ascii="Arial" w:hAnsi="Arial" w:cs="Arial"/>
           <w:highlight w:val="yellow"/>
         </w:rPr>
         <w:t xml:space="preserve"> </w:t>
       </w:r>
       <w:r>
         <w:rPr>
-          <w:rFonts w:ascii="Times New Roman" w:hAnsi="Times New Roman" w:cs="Times New Roman"/>
-          <w:sz w:val="24"/>
-          <w:szCs w:val="24"/>
+          <w:rFonts w:ascii="Arial" w:hAnsi="Arial" w:cs="Arial"/>
           <w:highlight w:val="yellow"/>
         </w:rPr>
         <w:t>child</w:t>
       </w:r>
       <w:r>
         <w:rPr>
-          <w:rFonts w:ascii="Times New Roman" w:hAnsi="Times New Roman" w:cs="Times New Roman"/>
-          <w:sz w:val="24"/>
-          <w:szCs w:val="24"/>
+          <w:rFonts w:ascii="Arial" w:hAnsi="Arial" w:cs="Arial"/>
           <w:highlight w:val="yellow"/>
         </w:rPr>
         <w:t xml:space="preserve"> </w:t>
       </w:r>
       <w:r>
         <w:rPr>
-          <w:rFonts w:ascii="Times New Roman" w:hAnsi="Times New Roman" w:cs="Times New Roman"/>
-          <w:sz w:val="24"/>
-          <w:szCs w:val="24"/>
+          <w:rFonts w:ascii="Arial" w:hAnsi="Arial" w:cs="Arial"/>
         </w:rPr>
         <w:t>}}</w:t>
       </w:r>
       <w:r>
         <w:rPr>
-          <w:rFonts w:ascii="Times New Roman" w:hAnsi="Times New Roman" w:cs="Times New Roman"/>
-          <w:sz w:val="24"/>
-          <w:szCs w:val="24"/>
+          <w:rFonts w:ascii="Arial" w:hAnsi="Arial" w:cs="Arial"/>
         </w:rPr>
         <w:t xml:space="preserve"> -</w:t>
       </w:r>
       <w:r>
         <w:rPr>
-          <w:rFonts w:ascii="Times New Roman" w:hAnsi="Times New Roman" w:cs="Times New Roman"/>
-          <w:sz w:val="24"/>
-          <w:szCs w:val="24"/>
+          <w:rFonts w:ascii="Arial" w:hAnsi="Arial" w:cs="Arial"/>
         </w:rPr>
         <w:t xml:space="preserve"> </w:t>
       </w:r>
       <w:r>
         <w:rPr>
-          <w:rFonts w:ascii="Times New Roman" w:hAnsi="Times New Roman" w:cs="Times New Roman"/>
-          <w:sz w:val="24"/>
-          <w:szCs w:val="24"/>
+          <w:rFonts w:ascii="Arial" w:hAnsi="Arial" w:cs="Arial"/>
         </w:rPr>
         <w:t xml:space="preserve"> </w:t>
       </w:r>
       <w:r>
         <w:rPr>
-          <w:rFonts w:ascii="Times New Roman" w:hAnsi="Times New Roman" w:cs="Times New Roman"/>
-          <w:sz w:val="24"/>
-          <w:szCs w:val="24"/>
+          <w:rFonts w:ascii="Arial" w:hAnsi="Arial" w:cs="Arial"/>
         </w:rPr>
         <w:t>Annual o</w:t>
       </w:r>
       <w:r>
         <w:rPr>
-          <w:rFonts w:ascii="Times New Roman" w:hAnsi="Times New Roman" w:cs="Times New Roman"/>
-          <w:sz w:val="24"/>
-          <w:szCs w:val="24"/>
+          <w:rFonts w:ascii="Arial" w:hAnsi="Arial" w:cs="Arial"/>
         </w:rPr>
         <w:t>vernights with payer: ________</w:t>
       </w:r>
@@ -223,58 +145,28 @@
           <w:tab w:val="left" w:leader="dot" w:pos="5760"/>
         </w:tabs>
         <w:rPr>
-          <w:rFonts w:ascii="Times New Roman" w:hAnsi="Times New Roman" w:cs="Times New Roman"/>
-          <w:sz w:val="24"/>
-          <w:szCs w:val="24"/>
+          <w:rFonts w:ascii="Arial" w:hAnsi="Arial" w:cs="Arial"/>
         </w:rPr>
       </w:pPr>
       <w:r>
         <w:rPr>
-          <w:rFonts w:ascii="Times New Roman" w:hAnsi="Times New Roman" w:cs="Times New Roman"/>
-          <w:sz w:val="24"/>
-          <w:szCs w:val="24"/>
+          <w:rFonts w:ascii="Arial" w:hAnsi="Arial" w:cs="Arial"/>
         </w:rPr>
         <w:t>{%</w:t>
       </w:r>
       <w:r>
         <w:rPr>
-          <w:rFonts w:ascii="Times New Roman" w:hAnsi="Times New Roman" w:cs="Times New Roman"/>
-          <w:sz w:val="24"/>
-          <w:szCs w:val="24"/>
+          <w:rFonts w:ascii="Arial" w:hAnsi="Arial" w:cs="Arial"/>
           <w:highlight w:val="cyan"/>
         </w:rPr>
-        <w:t xml:space="preserve">p </w:t>
-      </w:r>
-      <w:proofErr w:type="spellStart"/>
-      <w:proofErr w:type="gramStart"/>
-      <w:r>
-        <w:rPr>
-          <w:rFonts w:ascii="Times New Roman" w:hAnsi="Times New Roman" w:cs="Times New Roman"/>
-          <w:sz w:val="24"/>
-          <w:szCs w:val="24"/>
-          <w:highlight w:val="cyan"/>
-        </w:rPr>
-        <w:t>endfor</w:t>
-      </w:r>
-      <w:proofErr w:type="spellEnd"/>
-      <w:r>
-        <w:rPr>
-          <w:rFonts w:ascii="Times New Roman" w:hAnsi="Times New Roman" w:cs="Times New Roman"/>
-          <w:sz w:val="24"/>
-          <w:szCs w:val="24"/>
-          <w:highlight w:val="cyan"/>
-        </w:rPr>
-        <w:t xml:space="preserve"> </w:t>
-      </w:r>
-      <w:r>
-        <w:rPr>
-          <w:rFonts w:ascii="Times New Roman" w:hAnsi="Times New Roman" w:cs="Times New Roman"/>
-          <w:sz w:val="24"/>
-          <w:szCs w:val="24"/>
+        <w:t xml:space="preserve">p endfor </w:t>
+      </w:r>
+      <w:r>
+        <w:rPr>
+          <w:rFonts w:ascii="Arial" w:hAnsi="Arial" w:cs="Arial"/>
         </w:rPr>
         <w:t>%}</w:t>
       </w:r>
-      <w:proofErr w:type="gramEnd"/>
     </w:p>
     <w:p>
       <w:pPr>
@@ -286,8 +178,12 @@
       </w:pPr>
     </w:p>
     <w:sectPr>
-      <w:headerReference w:type="default" r:id="rId7"/>
-      <w:footerReference w:type="default" r:id="rId8"/>
+      <w:headerReference w:type="even" r:id="rId7"/>
+      <w:headerReference w:type="default" r:id="rId8"/>
+      <w:footerReference w:type="even" r:id="rId9"/>
+      <w:footerReference w:type="default" r:id="rId10"/>
+      <w:headerReference w:type="first" r:id="rId11"/>
+      <w:footerReference w:type="first" r:id="rId12"/>
       <w:pgSz w:w="12240" w:h="15840"/>
       <w:pgMar w:top="1497" w:right="1080" w:bottom="1440" w:left="1080" w:header="1440" w:footer="1008" w:gutter="0"/>
       <w:pgNumType w:start="2"/>
@@ -328,18 +224,28 @@
 <w:ftr xmlns:wpc="http://schemas.microsoft.com/office/word/2010/wordprocessingCanvas" xmlns:cx="http://schemas.microsoft.com/office/drawing/2014/chartex" xmlns:cx1="http://schemas.microsoft.com/office/drawing/2015/9/8/chartex" xmlns:cx2="http://schemas.microsoft.com/office/drawing/2015/10/21/chartex" xmlns:cx3="http://schemas.microsoft.com/office/drawing/2016/5/9/chartex" xmlns:cx4="http://schemas.microsoft.com/office/drawing/2016/5/10/chartex" xmlns:cx5="http://schemas.microsoft.com/office/drawing/2016/5/11/chartex" xmlns:cx6="http://schemas.microsoft.com/office/drawing/2016/5/12/chartex" xmlns:cx7="http://schemas.microsoft.com/office/drawing/2016/5/13/chartex" xmlns:cx8="http://schemas.microsoft.com/office/drawing/2016/5/14/chartex" xmlns:mc="http://schemas.openxmlformats.org/markup-compatibility/2006" xmlns:aink="http://schemas.microsoft.com/office/drawing/2016/ink" xmlns:am3d="http://schemas.microsoft.com/office/drawing/2017/model3d" xmlns:o="urn:schemas-microsoft-com:office:office" xmlns:oel="http://schemas.microsoft.com/office/2019/extlst" xmlns:r="http://schemas.openxmlformats.org/officeDocument/2006/relationships" xmlns:m="http://schemas.openxmlformats.org/officeDocument/2006/math" xmlns:v="urn:schemas-microsoft-com:vml" xmlns:wp14="http://schemas.microsoft.com/office/word/2010/wordprocessingDrawing" xmlns:wp="http://schemas.openxmlformats.org/drawingml/2006/wordprocessingDrawing" xmlns:w10="urn:schemas-microsoft-com:office:word" xmlns:w="http://schemas.openxmlformats.org/wordprocessingml/2006/main" xmlns:w14="http://schemas.microsoft.com/office/word/2010/wordml" xmlns:w15="http://schemas.microsoft.com/office/word/2012/wordml" xmlns:w16cex="http://schemas.microsoft.com/office/word/2018/wordml/cex" xmlns:w16cid="http://schemas.microsoft.com/office/word/2016/wordml/cid" xmlns:w16="http://schemas.microsoft.com/office/word/2018/wordml" xmlns:w16du="http://schemas.microsoft.com/office/word/2023/wordml/word16du" xmlns:w16sdtdh="http://schemas.microsoft.com/office/word/2020/wordml/sdtdatahash" xmlns:w16sdtfl="http://schemas.microsoft.com/office/word/2024/wordml/sdtformatlock" xmlns:w16se="http://schemas.microsoft.com/office/word/2015/wordml/symex" xmlns:wpg="http://schemas.microsoft.com/office/word/2010/wordprocessingGroup" xmlns:wpi="http://schemas.microsoft.com/office/word/2010/wordprocessingInk" xmlns:wne="http://schemas.microsoft.com/office/word/2006/wordml" xmlns:wps="http://schemas.microsoft.com/office/word/2010/wordprocessingShape" mc:Ignorable="w14 w15 w16se w16cid w16 w16cex w16sdtdh w16sdtfl w16du wp14">
   <w:p>
     <w:pPr>
+      <w:pStyle w:val="Footer"/>
+    </w:pPr>
+  </w:p>
+</w:ftr>
+</file>
+
+<file path=word/footer2.xml><?xml version="1.0" encoding="utf-8"?>
+<w:ftr xmlns:wpc="http://schemas.microsoft.com/office/word/2010/wordprocessingCanvas" xmlns:cx="http://schemas.microsoft.com/office/drawing/2014/chartex" xmlns:cx1="http://schemas.microsoft.com/office/drawing/2015/9/8/chartex" xmlns:cx2="http://schemas.microsoft.com/office/drawing/2015/10/21/chartex" xmlns:cx3="http://schemas.microsoft.com/office/drawing/2016/5/9/chartex" xmlns:cx4="http://schemas.microsoft.com/office/drawing/2016/5/10/chartex" xmlns:cx5="http://schemas.microsoft.com/office/drawing/2016/5/11/chartex" xmlns:cx6="http://schemas.microsoft.com/office/drawing/2016/5/12/chartex" xmlns:cx7="http://schemas.microsoft.com/office/drawing/2016/5/13/chartex" xmlns:cx8="http://schemas.microsoft.com/office/drawing/2016/5/14/chartex" xmlns:mc="http://schemas.openxmlformats.org/markup-compatibility/2006" xmlns:aink="http://schemas.microsoft.com/office/drawing/2016/ink" xmlns:am3d="http://schemas.microsoft.com/office/drawing/2017/model3d" xmlns:o="urn:schemas-microsoft-com:office:office" xmlns:oel="http://schemas.microsoft.com/office/2019/extlst" xmlns:r="http://schemas.openxmlformats.org/officeDocument/2006/relationships" xmlns:m="http://schemas.openxmlformats.org/officeDocument/2006/math" xmlns:v="urn:schemas-microsoft-com:vml" xmlns:wp14="http://schemas.microsoft.com/office/word/2010/wordprocessingDrawing" xmlns:wp="http://schemas.openxmlformats.org/drawingml/2006/wordprocessingDrawing" xmlns:w10="urn:schemas-microsoft-com:office:word" xmlns:w="http://schemas.openxmlformats.org/wordprocessingml/2006/main" xmlns:w14="http://schemas.microsoft.com/office/word/2010/wordml" xmlns:w15="http://schemas.microsoft.com/office/word/2012/wordml" xmlns:w16cex="http://schemas.microsoft.com/office/word/2018/wordml/cex" xmlns:w16cid="http://schemas.microsoft.com/office/word/2016/wordml/cid" xmlns:w16="http://schemas.microsoft.com/office/word/2018/wordml" xmlns:w16du="http://schemas.microsoft.com/office/word/2023/wordml/word16du" xmlns:w16sdtdh="http://schemas.microsoft.com/office/word/2020/wordml/sdtdatahash" xmlns:w16sdtfl="http://schemas.microsoft.com/office/word/2024/wordml/sdtformatlock" xmlns:w16se="http://schemas.microsoft.com/office/word/2015/wordml/symex" xmlns:wpg="http://schemas.microsoft.com/office/word/2010/wordprocessingGroup" xmlns:wpi="http://schemas.microsoft.com/office/word/2010/wordprocessingInk" xmlns:wne="http://schemas.microsoft.com/office/word/2006/wordml" xmlns:wps="http://schemas.microsoft.com/office/word/2010/wordprocessingShape" mc:Ignorable="w14 w15 w16se w16cid w16 w16cex w16sdtdh w16sdtfl w16du wp14">
+  <w:p>
+    <w:pPr>
       <w:suppressAutoHyphens w:val="0"/>
       <w:spacing w:after="0"/>
       <w:jc w:val="center"/>
       <w:rPr>
-        <w:rFonts w:ascii="Helvetica" w:hAnsi="Helvetica" w:cs="Times New Roman"/>
+        <w:rFonts w:ascii="Arial" w:hAnsi="Arial" w:cs="Arial"/>
         <w:sz w:val="20"/>
         <w:szCs w:val="20"/>
       </w:rPr>
     </w:pPr>
     <w:r>
       <w:rPr>
-        <w:rFonts w:ascii="Helvetica" w:hAnsi="Helvetica" w:cs="Times New Roman"/>
+        <w:rFonts w:ascii="Arial" w:hAnsi="Arial" w:cs="Arial"/>
         <w:sz w:val="20"/>
         <w:szCs w:val="20"/>
       </w:rPr>
@@ -351,14 +257,14 @@
       <w:spacing w:after="0"/>
       <w:jc w:val="center"/>
       <w:rPr>
-        <w:rFonts w:ascii="Helvetica" w:hAnsi="Helvetica" w:cs="Times New Roman"/>
+        <w:rFonts w:ascii="Arial" w:hAnsi="Arial" w:cs="Arial"/>
         <w:sz w:val="20"/>
         <w:szCs w:val="20"/>
       </w:rPr>
     </w:pPr>
     <w:r>
       <w:rPr>
-        <w:rFonts w:ascii="Helvetica" w:hAnsi="Helvetica" w:cs="Times New Roman"/>
+        <w:rFonts w:ascii="Arial" w:hAnsi="Arial" w:cs="Arial"/>
         <w:sz w:val="20"/>
         <w:szCs w:val="20"/>
       </w:rPr>
@@ -366,7 +272,7 @@
     </w:r>
     <w:r>
       <w:rPr>
-        <w:rFonts w:ascii="Helvetica" w:hAnsi="Helvetica" w:cs="Times New Roman"/>
+        <w:rFonts w:ascii="Arial" w:hAnsi="Arial" w:cs="Arial"/>
         <w:sz w:val="20"/>
         <w:szCs w:val="20"/>
       </w:rPr>
@@ -378,36 +284,72 @@
       <w:suppressAutoHyphens w:val="0"/>
       <w:spacing w:after="0"/>
       <w:jc w:val="center"/>
+      <w:rPr>
+        <w:rFonts w:ascii="Arial" w:hAnsi="Arial" w:cs="Arial"/>
+        <w:sz w:val="20"/>
+        <w:szCs w:val="20"/>
+      </w:rPr>
     </w:pPr>
     <w:r>
       <w:rPr>
-        <w:rFonts w:ascii="Helvetica" w:hAnsi="Helvetica" w:cs="Times New Roman"/>
+        <w:rFonts w:ascii="Arial" w:hAnsi="Arial" w:cs="Arial"/>
         <w:sz w:val="20"/>
         <w:szCs w:val="20"/>
       </w:rPr>
       <w:t xml:space="preserve">Page </w:t>
     </w:r>
     <w:r>
+      <w:rPr>
+        <w:rFonts w:ascii="Arial" w:hAnsi="Arial" w:cs="Arial"/>
+        <w:sz w:val="20"/>
+        <w:szCs w:val="20"/>
+      </w:rPr>
       <w:fldChar w:fldCharType="begin"/>
     </w:r>
     <w:r>
+      <w:rPr>
+        <w:rFonts w:ascii="Arial" w:hAnsi="Arial" w:cs="Arial"/>
+        <w:sz w:val="20"/>
+        <w:szCs w:val="20"/>
+      </w:rPr>
       <w:instrText xml:space="preserve"> PAGE   \* MERGEFORMAT </w:instrText>
     </w:r>
     <w:r>
+      <w:rPr>
+        <w:rFonts w:ascii="Arial" w:hAnsi="Arial" w:cs="Arial"/>
+        <w:sz w:val="20"/>
+        <w:szCs w:val="20"/>
+      </w:rPr>
       <w:fldChar w:fldCharType="separate"/>
     </w:r>
     <w:r>
       <w:rPr>
+        <w:rFonts w:ascii="Arial" w:hAnsi="Arial" w:cs="Arial"/>
         <w:noProof/>
+        <w:sz w:val="20"/>
+        <w:szCs w:val="20"/>
       </w:rPr>
       <w:t>1</w:t>
     </w:r>
     <w:r>
       <w:rPr>
+        <w:rFonts w:ascii="Arial" w:hAnsi="Arial" w:cs="Arial"/>
         <w:noProof/>
+        <w:sz w:val="20"/>
+        <w:szCs w:val="20"/>
       </w:rPr>
       <w:fldChar w:fldCharType="end"/>
     </w:r>
+  </w:p>
+</w:ftr>
+</file>
+
+<file path=word/footer3.xml><?xml version="1.0" encoding="utf-8"?>
+<w:ftr xmlns:wpc="http://schemas.microsoft.com/office/word/2010/wordprocessingCanvas" xmlns:cx="http://schemas.microsoft.com/office/drawing/2014/chartex" xmlns:cx1="http://schemas.microsoft.com/office/drawing/2015/9/8/chartex" xmlns:cx2="http://schemas.microsoft.com/office/drawing/2015/10/21/chartex" xmlns:cx3="http://schemas.microsoft.com/office/drawing/2016/5/9/chartex" xmlns:cx4="http://schemas.microsoft.com/office/drawing/2016/5/10/chartex" xmlns:cx5="http://schemas.microsoft.com/office/drawing/2016/5/11/chartex" xmlns:cx6="http://schemas.microsoft.com/office/drawing/2016/5/12/chartex" xmlns:cx7="http://schemas.microsoft.com/office/drawing/2016/5/13/chartex" xmlns:cx8="http://schemas.microsoft.com/office/drawing/2016/5/14/chartex" xmlns:mc="http://schemas.openxmlformats.org/markup-compatibility/2006" xmlns:aink="http://schemas.microsoft.com/office/drawing/2016/ink" xmlns:am3d="http://schemas.microsoft.com/office/drawing/2017/model3d" xmlns:o="urn:schemas-microsoft-com:office:office" xmlns:oel="http://schemas.microsoft.com/office/2019/extlst" xmlns:r="http://schemas.openxmlformats.org/officeDocument/2006/relationships" xmlns:m="http://schemas.openxmlformats.org/officeDocument/2006/math" xmlns:v="urn:schemas-microsoft-com:vml" xmlns:wp14="http://schemas.microsoft.com/office/word/2010/wordprocessingDrawing" xmlns:wp="http://schemas.openxmlformats.org/drawingml/2006/wordprocessingDrawing" xmlns:w10="urn:schemas-microsoft-com:office:word" xmlns:w="http://schemas.openxmlformats.org/wordprocessingml/2006/main" xmlns:w14="http://schemas.microsoft.com/office/word/2010/wordml" xmlns:w15="http://schemas.microsoft.com/office/word/2012/wordml" xmlns:w16cex="http://schemas.microsoft.com/office/word/2018/wordml/cex" xmlns:w16cid="http://schemas.microsoft.com/office/word/2016/wordml/cid" xmlns:w16="http://schemas.microsoft.com/office/word/2018/wordml" xmlns:w16du="http://schemas.microsoft.com/office/word/2023/wordml/word16du" xmlns:w16sdtdh="http://schemas.microsoft.com/office/word/2020/wordml/sdtdatahash" xmlns:w16sdtfl="http://schemas.microsoft.com/office/word/2024/wordml/sdtformatlock" xmlns:w16se="http://schemas.microsoft.com/office/word/2015/wordml/symex" xmlns:wpg="http://schemas.microsoft.com/office/word/2010/wordprocessingGroup" xmlns:wpi="http://schemas.microsoft.com/office/word/2010/wordprocessingInk" xmlns:wne="http://schemas.microsoft.com/office/word/2006/wordml" xmlns:wps="http://schemas.microsoft.com/office/word/2010/wordprocessingShape" mc:Ignorable="w14 w15 w16se w16cid w16 w16cex w16sdtdh w16sdtfl w16du wp14">
+  <w:p>
+    <w:pPr>
+      <w:pStyle w:val="Footer"/>
+    </w:pPr>
   </w:p>
 </w:ftr>
 </file>
@@ -438,6 +380,16 @@
 </file>
 
 <file path=word/header1.xml><?xml version="1.0" encoding="utf-8"?>
+<w:hdr xmlns:wpc="http://schemas.microsoft.com/office/word/2010/wordprocessingCanvas" xmlns:cx="http://schemas.microsoft.com/office/drawing/2014/chartex" xmlns:cx1="http://schemas.microsoft.com/office/drawing/2015/9/8/chartex" xmlns:cx2="http://schemas.microsoft.com/office/drawing/2015/10/21/chartex" xmlns:cx3="http://schemas.microsoft.com/office/drawing/2016/5/9/chartex" xmlns:cx4="http://schemas.microsoft.com/office/drawing/2016/5/10/chartex" xmlns:cx5="http://schemas.microsoft.com/office/drawing/2016/5/11/chartex" xmlns:cx6="http://schemas.microsoft.com/office/drawing/2016/5/12/chartex" xmlns:cx7="http://schemas.microsoft.com/office/drawing/2016/5/13/chartex" xmlns:cx8="http://schemas.microsoft.com/office/drawing/2016/5/14/chartex" xmlns:mc="http://schemas.openxmlformats.org/markup-compatibility/2006" xmlns:aink="http://schemas.microsoft.com/office/drawing/2016/ink" xmlns:am3d="http://schemas.microsoft.com/office/drawing/2017/model3d" xmlns:o="urn:schemas-microsoft-com:office:office" xmlns:oel="http://schemas.microsoft.com/office/2019/extlst" xmlns:r="http://schemas.openxmlformats.org/officeDocument/2006/relationships" xmlns:m="http://schemas.openxmlformats.org/officeDocument/2006/math" xmlns:v="urn:schemas-microsoft-com:vml" xmlns:wp14="http://schemas.microsoft.com/office/word/2010/wordprocessingDrawing" xmlns:wp="http://schemas.openxmlformats.org/drawingml/2006/wordprocessingDrawing" xmlns:w10="urn:schemas-microsoft-com:office:word" xmlns:w="http://schemas.openxmlformats.org/wordprocessingml/2006/main" xmlns:w14="http://schemas.microsoft.com/office/word/2010/wordml" xmlns:w15="http://schemas.microsoft.com/office/word/2012/wordml" xmlns:w16cex="http://schemas.microsoft.com/office/word/2018/wordml/cex" xmlns:w16cid="http://schemas.microsoft.com/office/word/2016/wordml/cid" xmlns:w16="http://schemas.microsoft.com/office/word/2018/wordml" xmlns:w16du="http://schemas.microsoft.com/office/word/2023/wordml/word16du" xmlns:w16sdtdh="http://schemas.microsoft.com/office/word/2020/wordml/sdtdatahash" xmlns:w16sdtfl="http://schemas.microsoft.com/office/word/2024/wordml/sdtformatlock" xmlns:w16se="http://schemas.microsoft.com/office/word/2015/wordml/symex" xmlns:wpg="http://schemas.microsoft.com/office/word/2010/wordprocessingGroup" xmlns:wpi="http://schemas.microsoft.com/office/word/2010/wordprocessingInk" xmlns:wne="http://schemas.microsoft.com/office/word/2006/wordml" xmlns:wps="http://schemas.microsoft.com/office/word/2010/wordprocessingShape" mc:Ignorable="w14 w15 w16se w16cid w16 w16cex w16sdtdh w16sdtfl w16du wp14">
+  <w:p>
+    <w:pPr>
+      <w:pStyle w:val="Header"/>
+    </w:pPr>
+  </w:p>
+</w:hdr>
+</file>
+
+<file path=word/header2.xml><?xml version="1.0" encoding="utf-8"?>
 <w:hdr xmlns:wpc="http://schemas.microsoft.com/office/word/2010/wordprocessingCanvas" xmlns:cx="http://schemas.microsoft.com/office/drawing/2014/chartex" xmlns:cx1="http://schemas.microsoft.com/office/drawing/2015/9/8/chartex" xmlns:cx2="http://schemas.microsoft.com/office/drawing/2015/10/21/chartex" xmlns:cx3="http://schemas.microsoft.com/office/drawing/2016/5/9/chartex" xmlns:cx4="http://schemas.microsoft.com/office/drawing/2016/5/10/chartex" xmlns:cx5="http://schemas.microsoft.com/office/drawing/2016/5/11/chartex" xmlns:cx6="http://schemas.microsoft.com/office/drawing/2016/5/12/chartex" xmlns:cx7="http://schemas.microsoft.com/office/drawing/2016/5/13/chartex" xmlns:cx8="http://schemas.microsoft.com/office/drawing/2016/5/14/chartex" xmlns:mc="http://schemas.openxmlformats.org/markup-compatibility/2006" xmlns:aink="http://schemas.microsoft.com/office/drawing/2016/ink" xmlns:am3d="http://schemas.microsoft.com/office/drawing/2017/model3d" xmlns:o="urn:schemas-microsoft-com:office:office" xmlns:oel="http://schemas.microsoft.com/office/2019/extlst" xmlns:r="http://schemas.openxmlformats.org/officeDocument/2006/relationships" xmlns:m="http://schemas.openxmlformats.org/officeDocument/2006/math" xmlns:v="urn:schemas-microsoft-com:vml" xmlns:wp14="http://schemas.microsoft.com/office/word/2010/wordprocessingDrawing" xmlns:wp="http://schemas.openxmlformats.org/drawingml/2006/wordprocessingDrawing" xmlns:w10="urn:schemas-microsoft-com:office:word" xmlns:w="http://schemas.openxmlformats.org/wordprocessingml/2006/main" xmlns:w14="http://schemas.microsoft.com/office/word/2010/wordml" xmlns:w15="http://schemas.microsoft.com/office/word/2012/wordml" xmlns:w16cex="http://schemas.microsoft.com/office/word/2018/wordml/cex" xmlns:w16cid="http://schemas.microsoft.com/office/word/2016/wordml/cid" xmlns:w16="http://schemas.microsoft.com/office/word/2018/wordml" xmlns:w16du="http://schemas.microsoft.com/office/word/2023/wordml/word16du" xmlns:w16sdtdh="http://schemas.microsoft.com/office/word/2020/wordml/sdtdatahash" xmlns:w16sdtfl="http://schemas.microsoft.com/office/word/2024/wordml/sdtformatlock" xmlns:w16se="http://schemas.microsoft.com/office/word/2015/wordml/symex" xmlns:wpg="http://schemas.microsoft.com/office/word/2010/wordprocessingGroup" xmlns:wpi="http://schemas.microsoft.com/office/word/2010/wordprocessingInk" xmlns:wne="http://schemas.microsoft.com/office/word/2006/wordml" xmlns:wps="http://schemas.microsoft.com/office/word/2010/wordprocessingShape" mc:Ignorable="w14 w15 w16se w16cid w16 w16cex w16sdtdh w16sdtfl w16du wp14">
   <w:tbl>
     <w:tblPr>
@@ -471,14 +423,16 @@
             <w:spacing w:before="120" w:after="0"/>
             <w:jc w:val="right"/>
             <w:rPr>
-              <w:rFonts w:ascii="Helvetica" w:hAnsi="Helvetica" w:cs="Times New Roman"/>
+              <w:b/>
+              <w:bCs/>
               <w:sz w:val="20"/>
               <w:szCs w:val="20"/>
             </w:rPr>
           </w:pPr>
           <w:r>
             <w:rPr>
-              <w:rFonts w:ascii="Helvetica" w:hAnsi="Helvetica" w:cs="Times New Roman"/>
+              <w:b/>
+              <w:bCs/>
               <w:sz w:val="20"/>
               <w:szCs w:val="20"/>
             </w:rPr>
@@ -490,34 +444,45 @@
             <w:spacing w:after="0"/>
             <w:jc w:val="right"/>
             <w:rPr>
-              <w:rFonts w:ascii="Helvetica" w:hAnsi="Helvetica" w:cs="Times New Roman"/>
+              <w:b/>
+              <w:bCs/>
               <w:sz w:val="20"/>
               <w:szCs w:val="20"/>
             </w:rPr>
           </w:pPr>
-          <w:proofErr w:type="gramStart"/>
           <w:r>
             <w:rPr>
-              <w:rFonts w:ascii="Helvetica" w:hAnsi="Helvetica" w:cs="Times New Roman"/>
+              <w:b/>
+              <w:bCs/>
               <w:caps/>
               <w:sz w:val="20"/>
               <w:szCs w:val="20"/>
             </w:rPr>
-            <w:t>{{ the</w:t>
-          </w:r>
-          <w:proofErr w:type="gramEnd"/>
-          <w:r>
-            <w:rPr>
-              <w:rFonts w:ascii="Helvetica" w:hAnsi="Helvetica" w:cs="Times New Roman"/>
-              <w:caps/>
-              <w:sz w:val="20"/>
-              <w:szCs w:val="20"/>
-            </w:rPr>
-            <w:t>_court_number }}</w:t>
+            <w:t xml:space="preserve">{{ </w:t>
           </w:r>
           <w:r>
             <w:rPr>
-              <w:rFonts w:ascii="Helvetica" w:hAnsi="Helvetica" w:cs="Times New Roman"/>
+              <w:b/>
+              <w:bCs/>
+              <w:sz w:val="20"/>
+              <w:szCs w:val="20"/>
+            </w:rPr>
+            <w:t>the_court.number</w:t>
+          </w:r>
+          <w:r>
+            <w:rPr>
+              <w:b/>
+              <w:bCs/>
+              <w:caps/>
+              <w:sz w:val="20"/>
+              <w:szCs w:val="20"/>
+            </w:rPr>
+            <w:t xml:space="preserve"> }}</w:t>
+          </w:r>
+          <w:r>
+            <w:rPr>
+              <w:b/>
+              <w:bCs/>
               <w:sz w:val="20"/>
               <w:szCs w:val="20"/>
             </w:rPr>
@@ -534,29 +499,39 @@
               <w:szCs w:val="20"/>
             </w:rPr>
           </w:pPr>
-          <w:proofErr w:type="gramStart"/>
           <w:r>
             <w:rPr>
-              <w:rFonts w:ascii="Helvetica" w:hAnsi="Helvetica" w:cs="Times New Roman"/>
+              <w:b/>
+              <w:bCs/>
               <w:caps/>
               <w:sz w:val="20"/>
               <w:szCs w:val="20"/>
             </w:rPr>
-            <w:t>{{ county</w:t>
-          </w:r>
-          <w:proofErr w:type="gramEnd"/>
-          <w:r>
-            <w:rPr>
-              <w:rFonts w:ascii="Helvetica" w:hAnsi="Helvetica" w:cs="Times New Roman"/>
-              <w:caps/>
-              <w:sz w:val="20"/>
-              <w:szCs w:val="20"/>
-            </w:rPr>
-            <w:t xml:space="preserve">_choice }} </w:t>
+            <w:t xml:space="preserve">{{ </w:t>
           </w:r>
           <w:r>
             <w:rPr>
-              <w:rFonts w:ascii="Helvetica" w:hAnsi="Helvetica" w:cs="Times New Roman"/>
+              <w:b/>
+              <w:bCs/>
+              <w:sz w:val="20"/>
+              <w:szCs w:val="20"/>
+            </w:rPr>
+            <w:t>county_choice.upper()</w:t>
+          </w:r>
+          <w:r>
+            <w:rPr>
+              <w:b/>
+              <w:bCs/>
+              <w:caps/>
+              <w:sz w:val="20"/>
+              <w:szCs w:val="20"/>
+            </w:rPr>
+            <w:t xml:space="preserve"> }} </w:t>
+          </w:r>
+          <w:r>
+            <w:rPr>
+              <w:b/>
+              <w:bCs/>
               <w:sz w:val="20"/>
               <w:szCs w:val="20"/>
             </w:rPr>
@@ -578,14 +553,16 @@
             <w:spacing w:after="0"/>
             <w:jc w:val="center"/>
             <w:rPr>
-              <w:rFonts w:ascii="Helvetica" w:hAnsi="Helvetica" w:cs="Times New Roman"/>
+              <w:b/>
+              <w:bCs/>
               <w:sz w:val="20"/>
               <w:szCs w:val="20"/>
             </w:rPr>
           </w:pPr>
           <w:r>
             <w:rPr>
-              <w:rFonts w:ascii="Helvetica" w:hAnsi="Helvetica" w:cs="Times New Roman"/>
+              <w:b/>
+              <w:bCs/>
               <w:sz w:val="20"/>
               <w:szCs w:val="20"/>
             </w:rPr>
@@ -597,14 +574,16 @@
             <w:spacing w:after="0"/>
             <w:jc w:val="center"/>
             <w:rPr>
-              <w:rFonts w:ascii="Helvetica" w:hAnsi="Helvetica" w:cs="Times New Roman"/>
+              <w:b/>
+              <w:bCs/>
               <w:sz w:val="20"/>
               <w:szCs w:val="20"/>
             </w:rPr>
           </w:pPr>
           <w:r>
             <w:rPr>
-              <w:rFonts w:ascii="Helvetica" w:hAnsi="Helvetica" w:cs="Times New Roman"/>
+              <w:b/>
+              <w:bCs/>
               <w:sz w:val="20"/>
               <w:szCs w:val="20"/>
             </w:rPr>
@@ -612,7 +591,8 @@
           </w:r>
           <w:r>
             <w:rPr>
-              <w:rFonts w:ascii="Helvetica" w:hAnsi="Helvetica" w:cs="Times New Roman"/>
+              <w:b/>
+              <w:bCs/>
               <w:sz w:val="20"/>
               <w:szCs w:val="20"/>
             </w:rPr>
@@ -624,14 +604,16 @@
             <w:spacing w:after="0"/>
             <w:jc w:val="center"/>
             <w:rPr>
-              <w:rFonts w:ascii="Helvetica" w:hAnsi="Helvetica" w:cs="Times New Roman"/>
+              <w:b/>
+              <w:bCs/>
               <w:sz w:val="20"/>
               <w:szCs w:val="20"/>
             </w:rPr>
           </w:pPr>
           <w:r>
             <w:rPr>
-              <w:rFonts w:ascii="Helvetica" w:hAnsi="Helvetica" w:cs="Times New Roman"/>
+              <w:b/>
+              <w:bCs/>
               <w:sz w:val="20"/>
               <w:szCs w:val="20"/>
             </w:rPr>
@@ -654,14 +636,16 @@
             <w:spacing w:after="0"/>
             <w:jc w:val="center"/>
             <w:rPr>
-              <w:rFonts w:ascii="Helvetica" w:hAnsi="Helvetica" w:cs="Times New Roman"/>
+              <w:b/>
+              <w:bCs/>
               <w:sz w:val="20"/>
               <w:szCs w:val="20"/>
             </w:rPr>
           </w:pPr>
           <w:r>
             <w:rPr>
-              <w:rFonts w:ascii="Helvetica" w:hAnsi="Helvetica" w:cs="Times New Roman"/>
+              <w:b/>
+              <w:bCs/>
               <w:sz w:val="20"/>
               <w:szCs w:val="20"/>
             </w:rPr>
@@ -676,46 +660,29 @@
               <w:szCs w:val="20"/>
             </w:rPr>
           </w:pPr>
-          <w:proofErr w:type="gramStart"/>
           <w:r>
             <w:rPr>
-              <w:rFonts w:ascii="Helvetica" w:hAnsi="Helvetica" w:cs="Times New Roman"/>
-              <w:sz w:val="20"/>
-              <w:szCs w:val="20"/>
-            </w:rPr>
-            <w:t xml:space="preserve">{{ </w:t>
-          </w:r>
-          <w:proofErr w:type="spellStart"/>
-          <w:r>
-            <w:rPr>
-              <w:rFonts w:ascii="Helvetica" w:hAnsi="Helvetica" w:cs="Times New Roman"/>
-              <w:sz w:val="20"/>
-              <w:szCs w:val="20"/>
-            </w:rPr>
-            <w:t>docket</w:t>
-          </w:r>
-          <w:proofErr w:type="gramEnd"/>
-          <w:r>
-            <w:rPr>
-              <w:rFonts w:ascii="Helvetica" w:hAnsi="Helvetica" w:cs="Times New Roman"/>
-              <w:sz w:val="20"/>
-              <w:szCs w:val="20"/>
-            </w:rPr>
-            <w:t>_number</w:t>
-          </w:r>
-          <w:proofErr w:type="spellEnd"/>
-          <w:r>
-            <w:rPr>
-              <w:rFonts w:ascii="Helvetica" w:hAnsi="Helvetica" w:cs="Times New Roman"/>
-              <w:sz w:val="20"/>
-              <w:szCs w:val="20"/>
-            </w:rPr>
-            <w:t xml:space="preserve"> }}</w:t>
+              <w:b/>
+              <w:bCs/>
+              <w:sz w:val="20"/>
+              <w:szCs w:val="20"/>
+            </w:rPr>
+            <w:t>{{ docket_number }}</w:t>
           </w:r>
         </w:p>
       </w:tc>
     </w:tr>
   </w:tbl>
+  <w:p>
+    <w:pPr>
+      <w:pStyle w:val="Header"/>
+    </w:pPr>
+  </w:p>
+</w:hdr>
+</file>
+
+<file path=word/header3.xml><?xml version="1.0" encoding="utf-8"?>
+<w:hdr xmlns:wpc="http://schemas.microsoft.com/office/word/2010/wordprocessingCanvas" xmlns:cx="http://schemas.microsoft.com/office/drawing/2014/chartex" xmlns:cx1="http://schemas.microsoft.com/office/drawing/2015/9/8/chartex" xmlns:cx2="http://schemas.microsoft.com/office/drawing/2015/10/21/chartex" xmlns:cx3="http://schemas.microsoft.com/office/drawing/2016/5/9/chartex" xmlns:cx4="http://schemas.microsoft.com/office/drawing/2016/5/10/chartex" xmlns:cx5="http://schemas.microsoft.com/office/drawing/2016/5/11/chartex" xmlns:cx6="http://schemas.microsoft.com/office/drawing/2016/5/12/chartex" xmlns:cx7="http://schemas.microsoft.com/office/drawing/2016/5/13/chartex" xmlns:cx8="http://schemas.microsoft.com/office/drawing/2016/5/14/chartex" xmlns:mc="http://schemas.openxmlformats.org/markup-compatibility/2006" xmlns:aink="http://schemas.microsoft.com/office/drawing/2016/ink" xmlns:am3d="http://schemas.microsoft.com/office/drawing/2017/model3d" xmlns:o="urn:schemas-microsoft-com:office:office" xmlns:oel="http://schemas.microsoft.com/office/2019/extlst" xmlns:r="http://schemas.openxmlformats.org/officeDocument/2006/relationships" xmlns:m="http://schemas.openxmlformats.org/officeDocument/2006/math" xmlns:v="urn:schemas-microsoft-com:vml" xmlns:wp14="http://schemas.microsoft.com/office/word/2010/wordprocessingDrawing" xmlns:wp="http://schemas.openxmlformats.org/drawingml/2006/wordprocessingDrawing" xmlns:w10="urn:schemas-microsoft-com:office:word" xmlns:w="http://schemas.openxmlformats.org/wordprocessingml/2006/main" xmlns:w14="http://schemas.microsoft.com/office/word/2010/wordml" xmlns:w15="http://schemas.microsoft.com/office/word/2012/wordml" xmlns:w16cex="http://schemas.microsoft.com/office/word/2018/wordml/cex" xmlns:w16cid="http://schemas.microsoft.com/office/word/2016/wordml/cid" xmlns:w16="http://schemas.microsoft.com/office/word/2018/wordml" xmlns:w16du="http://schemas.microsoft.com/office/word/2023/wordml/word16du" xmlns:w16sdtdh="http://schemas.microsoft.com/office/word/2020/wordml/sdtdatahash" xmlns:w16sdtfl="http://schemas.microsoft.com/office/word/2024/wordml/sdtformatlock" xmlns:w16se="http://schemas.microsoft.com/office/word/2015/wordml/symex" xmlns:wpg="http://schemas.microsoft.com/office/word/2010/wordprocessingGroup" xmlns:wpi="http://schemas.microsoft.com/office/word/2010/wordprocessingInk" xmlns:wne="http://schemas.microsoft.com/office/word/2006/wordml" xmlns:wps="http://schemas.microsoft.com/office/word/2010/wordprocessingShape" mc:Ignorable="w14 w15 w16se w16cid w16 w16cex w16sdtdh w16sdtfl w16du wp14">
   <w:p>
     <w:pPr>
       <w:pStyle w:val="Header"/>

</xml_diff>